<commit_message>
test(quiz): await version preference persistence
</commit_message>
<xml_diff>
--- a/jackyun-portal/docs/sync-v5-full-data-recovery-progress-3.58.3-20261028.docx
+++ b/jackyun-portal/docs/sync-v5-full-data-recovery-progress-3.58.3-20261028.docx
@@ -569,7 +569,12 @@
     </w:p>
     <w:p>
       <w:r>
-        <w:t xml:space="preserve">本次为 3.58.3 稳定性修复，不改同步协议、数据库或生产灰度。GitHub Actions 最新 SHA 与 Vercel Preview 状态需在该提交重新核对；4.0.0 前仍必须完成独立业务数据适配、staging/生产实际迁移读写证据、双浏览器离线冲突回滚和实体手机验收。</w:t>
+        <w:t xml:space="preserve">本次为 3.58.3 稳定性修复，不改同步协议、数据库或生产灰度。GitHub Actions run 40601080902（SHA 02c573a）中生产构建、Type/lint 与 Existing data safety regressions 通过；Run production UI flows 失败，失败包含 shell 主题状态、Quiz 版本切换立即读写、IELTS dashboard、旧 iframe/theme、study guide、music player、answer sheet、CUE route/search 和 review queue。Quiz 的产品页面文件不在 PR 改动中，本机 Edge 同一浏览器套件 6/6 通过；其跨浏览器断言现改为等待 localStorage 状态，不降低断言。准确 main SHA 382ea47 的本机工作区未包含后续 Quiz 版本选择流程，因此该整组 CI UI 失败仍不应标为已证实历史基线；它们也不是同步安全测试结果。最新提交 CI 及 Preview 需重新核对。</w:t>
+      </w:r>
+    </w:p>
+    <w:p>
+      <w:r>
+        <w:t xml:space="preserve">4.0.0 前仍必须完成独立业务数据适配、staging/生产真实迁移的计数与哈希、受限账号认证读写及 receipt/SHA/RLS、两个独立浏览器双向/离线/冲突/回滚验收，以及实体手机验收。当前距离真实 v5 端到端仍差这些线上数据与设备证据；不创建 Supabase 分支、不扩大灰度，也不移除运行时 v4 兼容。</w:t>
       </w:r>
     </w:p>
     <w:sectPr>

</xml_diff>